<commit_message>
chore: retire les liens LinkedIn (CV PDF+Word et site)
</commit_message>
<xml_diff>
--- a/cv/CheikhSall_CV.docx
+++ b/cv/CheikhSall_CV.docx
@@ -53,7 +53,7 @@
         <w:spacing w:after="120"/>
         <w:jc w:val="center"/>
       </w:pPr>
-      <w:hyperlink w:history="1" r:id="rIdqswv-ssovaufc9fpca3oc">
+      <w:hyperlink w:history="1" r:id="rIdmlo3qxtx-fdsrhed_kp0f">
         <w:r>
           <w:rPr>
             <w:rStyle w:val="Hyperlink"/>
@@ -71,7 +71,7 @@
         </w:rPr>
         <w:t xml:space="preserve">   •   </w:t>
       </w:r>
-      <w:hyperlink w:history="1" r:id="rIdhozdbursjaicmgnoas4nz">
+      <w:hyperlink w:history="1" r:id="rIdyfb52ezn81q7n6qb74ayp">
         <w:r>
           <w:rPr>
             <w:rStyle w:val="Hyperlink"/>
@@ -81,14 +81,6 @@
           <w:t xml:space="preserve">kheuch1492.github.io</w:t>
         </w:r>
       </w:hyperlink>
-      <w:r>
-        <w:rPr>
-          <w:color w:val="555555"/>
-          <w:sz w:val="18"/>
-          <w:szCs w:val="18"/>
-        </w:rPr>
-        <w:t xml:space="preserve">   •   LinkedIn</w:t>
-      </w:r>
     </w:p>
     <w:p>
       <w:pPr>
@@ -629,7 +621,7 @@
         </w:rPr>
         <w:t xml:space="preserve">Portfolio complet : </w:t>
       </w:r>
-      <w:hyperlink w:history="1" r:id="rId3a4unmvsa1npl4u8vt25v">
+      <w:hyperlink w:history="1" r:id="rIdcbcz9hibx2hev4lxujqbf">
         <w:r>
           <w:rPr>
             <w:rStyle w:val="Hyperlink"/>

</xml_diff>

<commit_message>
chore: aligne le titre sur Data Analyst | BI Engineer (CV PDF+Word, README)
</commit_message>
<xml_diff>
--- a/cv/CheikhSall_CV.docx
+++ b/cv/CheikhSall_CV.docx
@@ -31,7 +31,7 @@
           <w:sz w:val="24"/>
           <w:szCs w:val="24"/>
         </w:rPr>
-        <w:t xml:space="preserve">Data Scientist &amp; Business Intelligence Engineer</w:t>
+        <w:t xml:space="preserve">Data Analyst | Business Intelligence Engineer</w:t>
       </w:r>
     </w:p>
     <w:p>
@@ -53,7 +53,7 @@
         <w:spacing w:after="120"/>
         <w:jc w:val="center"/>
       </w:pPr>
-      <w:hyperlink w:history="1" r:id="rIdmlo3qxtx-fdsrhed_kp0f">
+      <w:hyperlink w:history="1" r:id="rIdgvcuzep-0fa-sqfn4t7h7">
         <w:r>
           <w:rPr>
             <w:rStyle w:val="Hyperlink"/>
@@ -71,7 +71,7 @@
         </w:rPr>
         <w:t xml:space="preserve">   •   </w:t>
       </w:r>
-      <w:hyperlink w:history="1" r:id="rIdyfb52ezn81q7n6qb74ayp">
+      <w:hyperlink w:history="1" r:id="rIdkot0_9dyraroy84wbdc3r">
         <w:r>
           <w:rPr>
             <w:rStyle w:val="Hyperlink"/>
@@ -621,7 +621,7 @@
         </w:rPr>
         <w:t xml:space="preserve">Portfolio complet : </w:t>
       </w:r>
-      <w:hyperlink w:history="1" r:id="rIdcbcz9hibx2hev4lxujqbf">
+      <w:hyperlink w:history="1" r:id="rIdri6ioun4ammj-vxurgywh">
         <w:r>
           <w:rPr>
             <w:rStyle w:val="Hyperlink"/>

</xml_diff>

<commit_message>
feat: ajoute le lien LinkedIn (cheikh-sall-bi) sur le site et le CV
</commit_message>
<xml_diff>
--- a/cv/CheikhSall_CV.docx
+++ b/cv/CheikhSall_CV.docx
@@ -53,7 +53,7 @@
         <w:spacing w:after="120"/>
         <w:jc w:val="center"/>
       </w:pPr>
-      <w:hyperlink w:history="1" r:id="rIdgvcuzep-0fa-sqfn4t7h7">
+      <w:hyperlink w:history="1" r:id="rIdzxlkl8ekwfhjmgplh51vk">
         <w:r>
           <w:rPr>
             <w:rStyle w:val="Hyperlink"/>
@@ -71,7 +71,7 @@
         </w:rPr>
         <w:t xml:space="preserve">   •   </w:t>
       </w:r>
-      <w:hyperlink w:history="1" r:id="rIdkot0_9dyraroy84wbdc3r">
+      <w:hyperlink w:history="1" r:id="rIdcexotu5inlf0knajkiuet">
         <w:r>
           <w:rPr>
             <w:rStyle w:val="Hyperlink"/>
@@ -81,6 +81,24 @@
           <w:t xml:space="preserve">kheuch1492.github.io</w:t>
         </w:r>
       </w:hyperlink>
+      <w:r>
+        <w:rPr>
+          <w:color w:val="555555"/>
+          <w:sz w:val="18"/>
+          <w:szCs w:val="18"/>
+        </w:rPr>
+        <w:t xml:space="preserve">   •   </w:t>
+      </w:r>
+      <w:hyperlink w:history="1" r:id="rIdacf8phto2izqsk1whdfon">
+        <w:r>
+          <w:rPr>
+            <w:rStyle w:val="Hyperlink"/>
+            <w:sz w:val="19"/>
+            <w:szCs w:val="19"/>
+          </w:rPr>
+          <w:t xml:space="preserve">linkedin.com/in/cheikh-sall-bi</w:t>
+        </w:r>
+      </w:hyperlink>
     </w:p>
     <w:p>
       <w:pPr>
@@ -621,7 +639,7 @@
         </w:rPr>
         <w:t xml:space="preserve">Portfolio complet : </w:t>
       </w:r>
-      <w:hyperlink w:history="1" r:id="rIdri6ioun4ammj-vxurgywh">
+      <w:hyperlink w:history="1" r:id="rId-x4c4qou701ley_lvx5vm">
         <w:r>
           <w:rPr>
             <w:rStyle w:val="Hyperlink"/>

</xml_diff>

<commit_message>
feat: poste 1 reflete le fonctionnement radio (drive tests, CRC) - CV + portfolio
</commit_message>
<xml_diff>
--- a/cv/CheikhSall_CV.docx
+++ b/cv/CheikhSall_CV.docx
@@ -53,7 +53,7 @@
         <w:spacing w:after="120"/>
         <w:jc w:val="center"/>
       </w:pPr>
-      <w:hyperlink w:history="1" r:id="rIdzxlkl8ekwfhjmgplh51vk">
+      <w:hyperlink w:history="1" r:id="rIdgqfsdvm2-b9mdjmiupztj">
         <w:r>
           <w:rPr>
             <w:rStyle w:val="Hyperlink"/>
@@ -71,7 +71,7 @@
         </w:rPr>
         <w:t xml:space="preserve">   •   </w:t>
       </w:r>
-      <w:hyperlink w:history="1" r:id="rIdcexotu5inlf0knajkiuet">
+      <w:hyperlink w:history="1" r:id="rIdfrkdxld0g6pxydfcfv605">
         <w:r>
           <w:rPr>
             <w:rStyle w:val="Hyperlink"/>
@@ -89,7 +89,7 @@
         </w:rPr>
         <w:t xml:space="preserve">   •   </w:t>
       </w:r>
-      <w:hyperlink w:history="1" r:id="rIdacf8phto2izqsk1whdfon">
+      <w:hyperlink w:history="1" r:id="rIdftz0eaq0oo_5tz1wdlei4">
         <w:r>
           <w:rPr>
             <w:rStyle w:val="Hyperlink"/>
@@ -291,7 +291,7 @@
           <w:sz w:val="21"/>
           <w:szCs w:val="21"/>
         </w:rPr>
-        <w:t xml:space="preserve">Assistant Ingénieur — Support &amp; Analyse Qualité</w:t>
+        <w:t xml:space="preserve">Assistant Ingénieur — Support &amp; Analyse Qualité (Fonctionnement Radio)</w:t>
       </w:r>
       <w:r>
         <w:rPr>
@@ -333,7 +333,7 @@
           <w:sz w:val="20"/>
           <w:szCs w:val="20"/>
         </w:rPr>
-        <w:t xml:space="preserve">Conçu et industrialisé des pipelines ETL sous SSIS intégrant des données multi-sources, fiabilisant le reporting décisionnel.</w:t>
+        <w:t xml:space="preserve">Réalisé des drive tests et l'analyse CRC pour évaluer et améliorer la qualité du réseau radio.</w:t>
       </w:r>
     </w:p>
     <w:p>
@@ -350,7 +350,7 @@
           <w:sz w:val="20"/>
           <w:szCs w:val="20"/>
         </w:rPr>
-        <w:t xml:space="preserve">Développé des tableaux de bord Power BI de pilotage de la qualité du réseau radio, adoptés par les équipes opérationnelles.</w:t>
+        <w:t xml:space="preserve">Conçu et industrialisé des pipelines ETL (SSIS) intégrant des données multi-sources pour automatiser le reporting de qualité réseau.</w:t>
       </w:r>
     </w:p>
     <w:p>
@@ -367,7 +367,7 @@
           <w:sz w:val="20"/>
           <w:szCs w:val="20"/>
         </w:rPr>
-        <w:t xml:space="preserve">Automatisé la production, la mise à jour et la distribution des rapports, réduisant fortement le traitement manuel.</w:t>
+        <w:t xml:space="preserve">Développé des tableaux de bord Power BI de pilotage de la qualité radio (KPI), adoptés par les équipes opérationnelles.</w:t>
       </w:r>
     </w:p>
     <w:p>
@@ -384,7 +384,7 @@
           <w:sz w:val="20"/>
           <w:szCs w:val="20"/>
         </w:rPr>
-        <w:t xml:space="preserve">Défini et suivi les indicateurs clés de performance (KPI) pour l'amélioration continue de la qualité réseau.</w:t>
+        <w:t xml:space="preserve">Défini et suivi les KPI et automatisé la production et la distribution des rapports.</w:t>
       </w:r>
     </w:p>
     <w:p>
@@ -639,7 +639,7 @@
         </w:rPr>
         <w:t xml:space="preserve">Portfolio complet : </w:t>
       </w:r>
-      <w:hyperlink w:history="1" r:id="rId-x4c4qou701ley_lvx5vm">
+      <w:hyperlink w:history="1" r:id="rIdri99rmc-ypslrrfcqpv0v">
         <w:r>
           <w:rPr>
             <w:rStyle w:val="Hyperlink"/>

</xml_diff>

<commit_message>
Sync CV files with fixed GitHub/LinkedIn links
</commit_message>
<xml_diff>
--- a/cv/CheikhSall_CV.docx
+++ b/cv/CheikhSall_CV.docx
@@ -53,14 +53,14 @@
         <w:spacing w:after="120"/>
         <w:jc w:val="center"/>
       </w:pPr>
-      <w:hyperlink w:history="1" r:id="rIdgqfsdvm2-b9mdjmiupztj">
+      <w:hyperlink w:history="1" r:id="rIdllgonpiae63nt1cg7yqv4">
         <w:r>
           <w:rPr>
             <w:rStyle w:val="Hyperlink"/>
             <w:sz w:val="19"/>
             <w:szCs w:val="19"/>
           </w:rPr>
-          <w:t xml:space="preserve">github.com/kheuch1492</w:t>
+          <w:t xml:space="preserve">github.com/sallcheikh1492</w:t>
         </w:r>
       </w:hyperlink>
       <w:r>
@@ -71,14 +71,14 @@
         </w:rPr>
         <w:t xml:space="preserve">   •   </w:t>
       </w:r>
-      <w:hyperlink w:history="1" r:id="rIdfrkdxld0g6pxydfcfv605">
+      <w:hyperlink w:history="1" r:id="rIdxerwjooqss9rnf3sahqtq">
         <w:r>
           <w:rPr>
             <w:rStyle w:val="Hyperlink"/>
             <w:sz w:val="19"/>
             <w:szCs w:val="19"/>
           </w:rPr>
-          <w:t xml:space="preserve">kheuch1492.github.io</w:t>
+          <w:t xml:space="preserve">sallcheikh1492.github.io</w:t>
         </w:r>
       </w:hyperlink>
       <w:r>
@@ -89,7 +89,7 @@
         </w:rPr>
         <w:t xml:space="preserve">   •   </w:t>
       </w:r>
-      <w:hyperlink w:history="1" r:id="rIdftz0eaq0oo_5tz1wdlei4">
+      <w:hyperlink w:history="1" r:id="rIdjiprkzntjma2hs-do9ube">
         <w:r>
           <w:rPr>
             <w:rStyle w:val="Hyperlink"/>
@@ -639,14 +639,14 @@
         </w:rPr>
         <w:t xml:space="preserve">Portfolio complet : </w:t>
       </w:r>
-      <w:hyperlink w:history="1" r:id="rIdri99rmc-ypslrrfcqpv0v">
+      <w:hyperlink w:history="1" r:id="rIdhtrrldtgjdrdb5__qoeei">
         <w:r>
           <w:rPr>
             <w:rStyle w:val="Hyperlink"/>
             <w:sz w:val="19"/>
             <w:szCs w:val="19"/>
           </w:rPr>
-          <w:t xml:space="preserve">kheuch1492.github.io</w:t>
+          <w:t xml:space="preserve">sallcheikh1492.github.io</w:t>
         </w:r>
       </w:hyperlink>
     </w:p>

</xml_diff>

<commit_message>
Update experience, TV7-App project and CV with independent/S2N Multimedia work
Add the 2023-Present independent developer & data analyst role to the
experience timeline, refresh the TV7-App project card with production
details (1917 clients, JWT auth, SMS reminders, PWA), and sync the CV
files to match.
</commit_message>
<xml_diff>
--- a/cv/CheikhSall_CV.docx
+++ b/cv/CheikhSall_CV.docx
@@ -36,7 +36,7 @@
     </w:p>
     <w:p>
       <w:pPr>
-        <w:spacing w:after="40"/>
+        <w:spacing w:after="20"/>
         <w:jc w:val="center"/>
       </w:pPr>
       <w:r>
@@ -105,7 +105,7 @@
         <w:pBdr>
           <w:bottom w:val="single" w:color="1F4E79" w:sz="6" w:space="2"/>
         </w:pBdr>
-        <w:spacing w:after="80" w:before="240"/>
+        <w:spacing w:after="40" w:before="90"/>
       </w:pPr>
       <w:r>
         <w:rPr>
@@ -128,7 +128,7 @@
           <w:sz w:val="20"/>
           <w:szCs w:val="20"/>
         </w:rPr>
-        <w:t xml:space="preserve">Ingénieur en Business Intelligence (Master 2, Mention Bien) avec plus de 3 ans d'expérience chez Sonatel. J'industrialise la donnée — pipelines ETL, data warehouse, tableaux de bord Power BI et modèles de Machine Learning — pour transformer des données complexes en décisions à fort impact. Spécialiste de l'automatisation du reporting et de la conception de dashboards stratégiques, je combine expertise décisionnelle et data science.</w:t>
+        <w:t xml:space="preserve">Ingénieur en Business Intelligence (Master 2, Mention Bien), plus de 3 ans d'expérience chez Sonatel. J'industrialise la donnée — pipelines ETL, data warehouse, tableaux de bord Power BI et modèles de Machine Learning — pour transformer des données complexes en décisions à fort impact. Depuis 2023, je travaille en indépendant : analyses data publiées sur données réelles et applications conçues et exploitées en production pour des clients.</w:t>
       </w:r>
     </w:p>
     <w:p>
@@ -136,7 +136,7 @@
         <w:pBdr>
           <w:bottom w:val="single" w:color="1F4E79" w:sz="6" w:space="2"/>
         </w:pBdr>
-        <w:spacing w:after="80" w:before="240"/>
+        <w:spacing w:after="40" w:before="90"/>
       </w:pPr>
       <w:r>
         <w:rPr>
@@ -151,7 +151,7 @@
     </w:p>
     <w:p>
       <w:pPr>
-        <w:spacing w:after="30"/>
+        <w:spacing w:after="10"/>
       </w:pPr>
       <w:r>
         <w:rPr>
@@ -173,7 +173,7 @@
     </w:p>
     <w:p>
       <w:pPr>
-        <w:spacing w:after="30"/>
+        <w:spacing w:after="10"/>
       </w:pPr>
       <w:r>
         <w:rPr>
@@ -195,7 +195,7 @@
     </w:p>
     <w:p>
       <w:pPr>
-        <w:spacing w:after="30"/>
+        <w:spacing w:after="10"/>
       </w:pPr>
       <w:r>
         <w:rPr>
@@ -217,7 +217,7 @@
     </w:p>
     <w:p>
       <w:pPr>
-        <w:spacing w:after="30"/>
+        <w:spacing w:after="10"/>
       </w:pPr>
       <w:r>
         <w:rPr>
@@ -239,7 +239,7 @@
     </w:p>
     <w:p>
       <w:pPr>
-        <w:spacing w:after="30"/>
+        <w:spacing w:after="10"/>
       </w:pPr>
       <w:r>
         <w:rPr>
@@ -264,7 +264,7 @@
         <w:pBdr>
           <w:bottom w:val="single" w:color="1F4E79" w:sz="6" w:space="2"/>
         </w:pBdr>
-        <w:spacing w:after="80" w:before="240"/>
+        <w:spacing w:after="40" w:before="90"/>
       </w:pPr>
       <w:r>
         <w:rPr>
@@ -282,7 +282,7 @@
         <w:tabs>
           <w:tab w:val="right" w:pos="9026"/>
         </w:tabs>
-        <w:spacing w:after="0" w:before="120"/>
+        <w:spacing w:after="0" w:before="80"/>
       </w:pPr>
       <w:r>
         <w:rPr>
@@ -291,7 +291,7 @@
           <w:sz w:val="21"/>
           <w:szCs w:val="21"/>
         </w:rPr>
-        <w:t xml:space="preserve">Assistant Ingénieur — Support &amp; Analyse Qualité (Fonctionnement Radio)</w:t>
+        <w:t xml:space="preserve">Analyste de données &amp; Développeur — Indépendant</w:t>
       </w:r>
       <w:r>
         <w:rPr>
@@ -301,12 +301,12 @@
           <w:sz w:val="19"/>
           <w:szCs w:val="19"/>
         </w:rPr>
-        <w:t xml:space="preserve">	Mars 2020 – Mars 2022</w:t>
-      </w:r>
-    </w:p>
-    <w:p>
-      <w:pPr>
-        <w:spacing w:after="40"/>
+        <w:t xml:space="preserve">	2023 – Présent</w:t>
+      </w:r>
+    </w:p>
+    <w:p>
+      <w:pPr>
+        <w:spacing w:after="20"/>
       </w:pPr>
       <w:r>
         <w:rPr>
@@ -316,7 +316,7 @@
           <w:sz w:val="19"/>
           <w:szCs w:val="19"/>
         </w:rPr>
-        <w:t xml:space="preserve">Sonatel (DRPS/DEX) — Dakar</w:t>
+        <w:t xml:space="preserve">Missions clients (S2N Multimedia, depuis 2026) &amp; projets data publiés — Dakar</w:t>
       </w:r>
     </w:p>
     <w:p>
@@ -326,14 +326,14 @@
           <w:ilvl w:val="0"/>
           <w:numId w:val="2"/>
         </w:numPr>
-        <w:spacing w:after="40" w:line="260"/>
-      </w:pPr>
-      <w:r>
-        <w:rPr>
-          <w:sz w:val="20"/>
-          <w:szCs w:val="20"/>
-        </w:rPr>
-        <w:t xml:space="preserve">Réalisé des drive tests et l'analyse CRC pour évaluer et améliorer la qualité du réseau radio.</w:t>
+        <w:spacing w:after="20" w:line="240"/>
+      </w:pPr>
+      <w:r>
+        <w:rPr>
+          <w:sz w:val="20"/>
+          <w:szCs w:val="20"/>
+        </w:rPr>
+        <w:t xml:space="preserve">Conçu et mis en production une application de gestion et de recouvrement client (FastAPI, React, PostgreSQL/Supabase) pilotant 1 917 clients répartis sur 9 zones.</w:t>
       </w:r>
     </w:p>
     <w:p>
@@ -343,14 +343,14 @@
           <w:ilvl w:val="0"/>
           <w:numId w:val="2"/>
         </w:numPr>
-        <w:spacing w:after="40" w:line="260"/>
-      </w:pPr>
-      <w:r>
-        <w:rPr>
-          <w:sz w:val="20"/>
-          <w:szCs w:val="20"/>
-        </w:rPr>
-        <w:t xml:space="preserve">Conçu et industrialisé des pipelines ETL (SSIS) intégrant des données multi-sources pour automatiser le reporting de qualité réseau.</w:t>
+        <w:spacing w:after="20" w:line="240"/>
+      </w:pPr>
+      <w:r>
+        <w:rPr>
+          <w:sz w:val="20"/>
+          <w:szCs w:val="20"/>
+        </w:rPr>
+        <w:t xml:space="preserve">Modélisé la base et développé le suivi des encaissements : paiements partiels, opérations en masse, tableau de bord par collecteur, auth. par rôles (JWT) et relances SMS.</w:t>
       </w:r>
     </w:p>
     <w:p>
@@ -360,14 +360,14 @@
           <w:ilvl w:val="0"/>
           <w:numId w:val="2"/>
         </w:numPr>
-        <w:spacing w:after="40" w:line="260"/>
-      </w:pPr>
-      <w:r>
-        <w:rPr>
-          <w:sz w:val="20"/>
-          <w:szCs w:val="20"/>
-        </w:rPr>
-        <w:t xml:space="preserve">Développé des tableaux de bord Power BI de pilotage de la qualité radio (KPI), adoptés par les équipes opérationnelles.</w:t>
+        <w:spacing w:after="20" w:line="240"/>
+      </w:pPr>
+      <w:r>
+        <w:rPr>
+          <w:sz w:val="20"/>
+          <w:szCs w:val="20"/>
+        </w:rPr>
+        <w:t xml:space="preserve">Assuré le déploiement et l'exploitation en production (Render, Supabase, Vercel), avec version PWA installable.</w:t>
       </w:r>
     </w:p>
     <w:p>
@@ -377,14 +377,14 @@
           <w:ilvl w:val="0"/>
           <w:numId w:val="2"/>
         </w:numPr>
-        <w:spacing w:after="40" w:line="260"/>
-      </w:pPr>
-      <w:r>
-        <w:rPr>
-          <w:sz w:val="20"/>
-          <w:szCs w:val="20"/>
-        </w:rPr>
-        <w:t xml:space="preserve">Défini et suivi les KPI et automatisé la production et la distribution des rapports.</w:t>
+        <w:spacing w:after="20" w:line="240"/>
+      </w:pPr>
+      <w:r>
+        <w:rPr>
+          <w:sz w:val="20"/>
+          <w:szCs w:val="20"/>
+        </w:rPr>
+        <w:t xml:space="preserve">Conduit et publié des analyses data de bout en bout sur données réelles (ANSD, Banque mondiale, WFP) : modélisation, prévision SARIMA/Prophet et tableaux de bord.</w:t>
       </w:r>
     </w:p>
     <w:p>
@@ -392,7 +392,7 @@
         <w:tabs>
           <w:tab w:val="right" w:pos="9026"/>
         </w:tabs>
-        <w:spacing w:after="0" w:before="120"/>
+        <w:spacing w:after="0" w:before="80"/>
       </w:pPr>
       <w:r>
         <w:rPr>
@@ -401,7 +401,7 @@
           <w:sz w:val="21"/>
           <w:szCs w:val="21"/>
         </w:rPr>
-        <w:t xml:space="preserve">Stagiaire — BI &amp; Reporting</w:t>
+        <w:t xml:space="preserve">Assistant Ingénieur — Support &amp; Analyse Qualité (Fonctionnement Radio)</w:t>
       </w:r>
       <w:r>
         <w:rPr>
@@ -411,12 +411,12 @@
           <w:sz w:val="19"/>
           <w:szCs w:val="19"/>
         </w:rPr>
-        <w:t xml:space="preserve">	Déc. 2019 – Mars 2020</w:t>
-      </w:r>
-    </w:p>
-    <w:p>
-      <w:pPr>
-        <w:spacing w:after="40"/>
+        <w:t xml:space="preserve">	Mars 2020 – Mars 2022</w:t>
+      </w:r>
+    </w:p>
+    <w:p>
+      <w:pPr>
+        <w:spacing w:after="20"/>
       </w:pPr>
       <w:r>
         <w:rPr>
@@ -426,7 +426,7 @@
           <w:sz w:val="19"/>
           <w:szCs w:val="19"/>
         </w:rPr>
-        <w:t xml:space="preserve">Sonatel Technopole (DRPS/DEX/SES) — Dakar</w:t>
+        <w:t xml:space="preserve">Sonatel (DRPS/DEX) — Dakar</w:t>
       </w:r>
     </w:p>
     <w:p>
@@ -436,14 +436,65 @@
           <w:ilvl w:val="0"/>
           <w:numId w:val="2"/>
         </w:numPr>
-        <w:spacing w:after="40" w:line="260"/>
-      </w:pPr>
-      <w:r>
-        <w:rPr>
-          <w:sz w:val="20"/>
-          <w:szCs w:val="20"/>
-        </w:rPr>
-        <w:t xml:space="preserve">Automatisé le processus Flash QRR et développé un système de reporting de bout en bout.</w:t>
+        <w:spacing w:after="20" w:line="240"/>
+      </w:pPr>
+      <w:r>
+        <w:rPr>
+          <w:sz w:val="20"/>
+          <w:szCs w:val="20"/>
+        </w:rPr>
+        <w:t xml:space="preserve">Réalisé des drive tests et l'analyse CRC pour évaluer et améliorer la qualité du réseau radio.</w:t>
+      </w:r>
+    </w:p>
+    <w:p>
+      <w:pPr>
+        <w:pStyle w:val="ListParagraph"/>
+        <w:numPr>
+          <w:ilvl w:val="0"/>
+          <w:numId w:val="2"/>
+        </w:numPr>
+        <w:spacing w:after="20" w:line="240"/>
+      </w:pPr>
+      <w:r>
+        <w:rPr>
+          <w:sz w:val="20"/>
+          <w:szCs w:val="20"/>
+        </w:rPr>
+        <w:t xml:space="preserve">Conçu et industrialisé des pipelines ETL (SSIS) intégrant des données multi-sources pour automatiser le reporting de qualité réseau.</w:t>
+      </w:r>
+    </w:p>
+    <w:p>
+      <w:pPr>
+        <w:pStyle w:val="ListParagraph"/>
+        <w:numPr>
+          <w:ilvl w:val="0"/>
+          <w:numId w:val="2"/>
+        </w:numPr>
+        <w:spacing w:after="20" w:line="240"/>
+      </w:pPr>
+      <w:r>
+        <w:rPr>
+          <w:sz w:val="20"/>
+          <w:szCs w:val="20"/>
+        </w:rPr>
+        <w:t xml:space="preserve">Développé des tableaux de bord Power BI de pilotage de la qualité radio (KPI), adoptés par les équipes opérationnelles.</w:t>
+      </w:r>
+    </w:p>
+    <w:p>
+      <w:pPr>
+        <w:pStyle w:val="ListParagraph"/>
+        <w:numPr>
+          <w:ilvl w:val="0"/>
+          <w:numId w:val="2"/>
+        </w:numPr>
+        <w:spacing w:after="20" w:line="240"/>
+      </w:pPr>
+      <w:r>
+        <w:rPr>
+          <w:sz w:val="20"/>
+          <w:szCs w:val="20"/>
+        </w:rPr>
+        <w:t xml:space="preserve">Défini et suivi les KPI et automatisé la production et la distribution des rapports.</w:t>
       </w:r>
     </w:p>
     <w:p>
@@ -451,7 +502,7 @@
         <w:tabs>
           <w:tab w:val="right" w:pos="9026"/>
         </w:tabs>
-        <w:spacing w:after="0" w:before="120"/>
+        <w:spacing w:after="0" w:before="80"/>
       </w:pPr>
       <w:r>
         <w:rPr>
@@ -460,7 +511,7 @@
           <w:sz w:val="21"/>
           <w:szCs w:val="21"/>
         </w:rPr>
-        <w:t xml:space="preserve">Stagiaire — Support &amp; Analyse</w:t>
+        <w:t xml:space="preserve">Stagiaire — BI &amp; Reporting</w:t>
       </w:r>
       <w:r>
         <w:rPr>
@@ -470,12 +521,12 @@
           <w:sz w:val="19"/>
           <w:szCs w:val="19"/>
         </w:rPr>
-        <w:t xml:space="preserve">	Sept. 2019 – Déc. 2019</w:t>
-      </w:r>
-    </w:p>
-    <w:p>
-      <w:pPr>
-        <w:spacing w:after="40"/>
+        <w:t xml:space="preserve">	Déc. 2019 – Mars 2020</w:t>
+      </w:r>
+    </w:p>
+    <w:p>
+      <w:pPr>
+        <w:spacing w:after="20"/>
       </w:pPr>
       <w:r>
         <w:rPr>
@@ -485,7 +536,7 @@
           <w:sz w:val="19"/>
           <w:szCs w:val="19"/>
         </w:rPr>
-        <w:t xml:space="preserve">Sonatel Technopole (DRPS/DEX/Q2P) — Dakar</w:t>
+        <w:t xml:space="preserve">Sonatel Technopole (DRPS/DEX/SES) — Dakar</w:t>
       </w:r>
     </w:p>
     <w:p>
@@ -495,32 +546,56 @@
           <w:ilvl w:val="0"/>
           <w:numId w:val="2"/>
         </w:numPr>
-        <w:spacing w:after="40" w:line="260"/>
-      </w:pPr>
-      <w:r>
-        <w:rPr>
-          <w:sz w:val="20"/>
-          <w:szCs w:val="20"/>
-        </w:rPr>
-        <w:t xml:space="preserve">Personnalisé l'outil de gestion des plaintes Freshdesk et conçu des rapports analytiques de suivi de la relation client.</w:t>
-      </w:r>
-    </w:p>
-    <w:p>
-      <w:pPr>
-        <w:pBdr>
-          <w:bottom w:val="single" w:color="1F4E79" w:sz="6" w:space="2"/>
-        </w:pBdr>
-        <w:spacing w:after="80" w:before="240"/>
-      </w:pPr>
-      <w:r>
-        <w:rPr>
-          <w:b/>
-          <w:bCs/>
-          <w:color w:val="1F4E79"/>
-          <w:sz w:val="24"/>
-          <w:szCs w:val="24"/>
-        </w:rPr>
-        <w:t xml:space="preserve">PROJETS SÉLECTIONNÉS</w:t>
+        <w:spacing w:after="20" w:line="240"/>
+      </w:pPr>
+      <w:r>
+        <w:rPr>
+          <w:sz w:val="20"/>
+          <w:szCs w:val="20"/>
+        </w:rPr>
+        <w:t xml:space="preserve">Automatisé le processus Flash QRR et développé un système de reporting de bout en bout.</w:t>
+      </w:r>
+    </w:p>
+    <w:p>
+      <w:pPr>
+        <w:tabs>
+          <w:tab w:val="right" w:pos="9026"/>
+        </w:tabs>
+        <w:spacing w:after="0" w:before="80"/>
+      </w:pPr>
+      <w:r>
+        <w:rPr>
+          <w:b/>
+          <w:bCs/>
+          <w:sz w:val="21"/>
+          <w:szCs w:val="21"/>
+        </w:rPr>
+        <w:t xml:space="preserve">Stagiaire — Support &amp; Analyse</w:t>
+      </w:r>
+      <w:r>
+        <w:rPr>
+          <w:b/>
+          <w:bCs/>
+          <w:color w:val="E67E22"/>
+          <w:sz w:val="19"/>
+          <w:szCs w:val="19"/>
+        </w:rPr>
+        <w:t xml:space="preserve">	Sept. 2019 – Déc. 2019</w:t>
+      </w:r>
+    </w:p>
+    <w:p>
+      <w:pPr>
+        <w:spacing w:after="20"/>
+      </w:pPr>
+      <w:r>
+        <w:rPr>
+          <w:i/>
+          <w:iCs/>
+          <w:color w:val="555555"/>
+          <w:sz w:val="19"/>
+          <w:szCs w:val="19"/>
+        </w:rPr>
+        <w:t xml:space="preserve">Sonatel Technopole (DRPS/DEX/Q2P) — Dakar</w:t>
       </w:r>
     </w:p>
     <w:p>
@@ -530,23 +605,32 @@
           <w:ilvl w:val="0"/>
           <w:numId w:val="2"/>
         </w:numPr>
-        <w:spacing w:after="50" w:line="260"/>
-      </w:pPr>
-      <w:r>
-        <w:rPr>
-          <w:b/>
-          <w:bCs/>
-          <w:sz w:val="20"/>
-          <w:szCs w:val="20"/>
-        </w:rPr>
-        <w:t xml:space="preserve">Optimisation des centres d'appels (Mémoire M2) — </w:t>
-      </w:r>
-      <w:r>
-        <w:rPr>
-          <w:sz w:val="20"/>
-          <w:szCs w:val="20"/>
-        </w:rPr>
-        <w:t xml:space="preserve">Application BI &amp; ML (Python/Streamlit) : prévision du volume (SARIMA/LSTM), prédiction de l'abandon (XGBoost, AUC 0,72 + SHAP), analyse de survie (Kaplan-Meier/Cox) et dimensionnement Erlang.</w:t>
+        <w:spacing w:after="20" w:line="240"/>
+      </w:pPr>
+      <w:r>
+        <w:rPr>
+          <w:sz w:val="20"/>
+          <w:szCs w:val="20"/>
+        </w:rPr>
+        <w:t xml:space="preserve">Personnalisé l'outil de gestion des plaintes Freshdesk et conçu des rapports analytiques de suivi de la relation client.</w:t>
+      </w:r>
+    </w:p>
+    <w:p>
+      <w:pPr>
+        <w:pBdr>
+          <w:bottom w:val="single" w:color="1F4E79" w:sz="6" w:space="2"/>
+        </w:pBdr>
+        <w:spacing w:after="40" w:before="90"/>
+      </w:pPr>
+      <w:r>
+        <w:rPr>
+          <w:b/>
+          <w:bCs/>
+          <w:color w:val="1F4E79"/>
+          <w:sz w:val="24"/>
+          <w:szCs w:val="24"/>
+        </w:rPr>
+        <w:t xml:space="preserve">PROJETS SÉLECTIONNÉS</w:t>
       </w:r>
     </w:p>
     <w:p>
@@ -556,23 +640,23 @@
           <w:ilvl w:val="0"/>
           <w:numId w:val="2"/>
         </w:numPr>
-        <w:spacing w:after="50" w:line="260"/>
-      </w:pPr>
-      <w:r>
-        <w:rPr>
-          <w:b/>
-          <w:bCs/>
-          <w:sz w:val="20"/>
-          <w:szCs w:val="20"/>
-        </w:rPr>
-        <w:t xml:space="preserve">Customer Churn Prediction — </w:t>
-      </w:r>
-      <w:r>
-        <w:rPr>
-          <w:sz w:val="20"/>
-          <w:szCs w:val="20"/>
-        </w:rPr>
-        <w:t xml:space="preserve">Prédiction du départ client (Telco) — Gradient Boosting (ROC-AUC 0,844), EDA et dashboard Power BI.</w:t>
+        <w:spacing w:after="20" w:line="240"/>
+      </w:pPr>
+      <w:r>
+        <w:rPr>
+          <w:b/>
+          <w:bCs/>
+          <w:sz w:val="20"/>
+          <w:szCs w:val="20"/>
+        </w:rPr>
+        <w:t xml:space="preserve">Optimisation des centres d'appels (Mémoire M2) — </w:t>
+      </w:r>
+      <w:r>
+        <w:rPr>
+          <w:sz w:val="20"/>
+          <w:szCs w:val="20"/>
+        </w:rPr>
+        <w:t xml:space="preserve">Application BI &amp; ML (Python/Streamlit) : prévision du volume (SARIMA/LSTM), prédiction de l'abandon (XGBoost, AUC 0,72 + SHAP) et dimensionnement Erlang.</w:t>
       </w:r>
     </w:p>
     <w:p>
@@ -582,23 +666,23 @@
           <w:ilvl w:val="0"/>
           <w:numId w:val="2"/>
         </w:numPr>
-        <w:spacing w:after="50" w:line="260"/>
-      </w:pPr>
-      <w:r>
-        <w:rPr>
-          <w:b/>
-          <w:bCs/>
-          <w:sz w:val="20"/>
-          <w:szCs w:val="20"/>
-        </w:rPr>
-        <w:t xml:space="preserve">HR Analytics Dashboard — </w:t>
-      </w:r>
-      <w:r>
-        <w:rPr>
-          <w:sz w:val="20"/>
-          <w:szCs w:val="20"/>
-        </w:rPr>
-        <w:t xml:space="preserve">People Analytics : turnover, absentéisme et profils à risque (Python, PostgreSQL, Power BI / DAX).</w:t>
+        <w:spacing w:after="20" w:line="240"/>
+      </w:pPr>
+      <w:r>
+        <w:rPr>
+          <w:b/>
+          <w:bCs/>
+          <w:sz w:val="20"/>
+          <w:szCs w:val="20"/>
+        </w:rPr>
+        <w:t xml:space="preserve">Customer Churn Prediction — </w:t>
+      </w:r>
+      <w:r>
+        <w:rPr>
+          <w:sz w:val="20"/>
+          <w:szCs w:val="20"/>
+        </w:rPr>
+        <w:t xml:space="preserve">Départ client Telco — Gradient Boosting (ROC-AUC 0,844) et dashboard Power BI.</w:t>
       </w:r>
     </w:p>
     <w:p>
@@ -608,7 +692,33 @@
           <w:ilvl w:val="0"/>
           <w:numId w:val="2"/>
         </w:numPr>
-        <w:spacing w:after="50" w:line="260"/>
+        <w:spacing w:after="20" w:line="240"/>
+      </w:pPr>
+      <w:r>
+        <w:rPr>
+          <w:b/>
+          <w:bCs/>
+          <w:sz w:val="20"/>
+          <w:szCs w:val="20"/>
+        </w:rPr>
+        <w:t xml:space="preserve">HR Analytics Dashboard — </w:t>
+      </w:r>
+      <w:r>
+        <w:rPr>
+          <w:sz w:val="20"/>
+          <w:szCs w:val="20"/>
+        </w:rPr>
+        <w:t xml:space="preserve">Turnover, absentéisme et profils à risque (Python, PostgreSQL, Power BI / DAX).</w:t>
+      </w:r>
+    </w:p>
+    <w:p>
+      <w:pPr>
+        <w:pStyle w:val="ListParagraph"/>
+        <w:numPr>
+          <w:ilvl w:val="0"/>
+          <w:numId w:val="2"/>
+        </w:numPr>
+        <w:spacing w:after="20" w:line="240"/>
       </w:pPr>
       <w:r>
         <w:rPr>
@@ -624,38 +734,15 @@
           <w:sz w:val="20"/>
           <w:szCs w:val="20"/>
         </w:rPr>
-        <w:t xml:space="preserve">Analyse financière : KPI, compte de résultat, prévisions et dashboard (Python, SQL, Power BI).</w:t>
-      </w:r>
-    </w:p>
-    <w:p>
-      <w:pPr>
-        <w:spacing w:after="60"/>
-      </w:pPr>
-      <w:r>
-        <w:rPr>
-          <w:color w:val="555555"/>
-          <w:sz w:val="19"/>
-          <w:szCs w:val="19"/>
-        </w:rPr>
-        <w:t xml:space="preserve">Portfolio complet : </w:t>
-      </w:r>
-      <w:hyperlink w:history="1" r:id="rIdhtrrldtgjdrdb5__qoeei">
-        <w:r>
-          <w:rPr>
-            <w:rStyle w:val="Hyperlink"/>
-            <w:sz w:val="19"/>
-            <w:szCs w:val="19"/>
-          </w:rPr>
-          <w:t xml:space="preserve">sallcheikh1492.github.io</w:t>
-        </w:r>
-      </w:hyperlink>
+        <w:t xml:space="preserve">KPI, compte de résultat et prévisions (Python, SQL, Power BI).</w:t>
+      </w:r>
     </w:p>
     <w:p>
       <w:pPr>
         <w:pBdr>
           <w:bottom w:val="single" w:color="1F4E79" w:sz="6" w:space="2"/>
         </w:pBdr>
-        <w:spacing w:after="80" w:before="240"/>
+        <w:spacing w:after="40" w:before="90"/>
       </w:pPr>
       <w:r>
         <w:rPr>
@@ -799,7 +886,7 @@
         <w:pBdr>
           <w:bottom w:val="single" w:color="1F4E79" w:sz="6" w:space="2"/>
         </w:pBdr>
-        <w:spacing w:after="80" w:before="240"/>
+        <w:spacing w:after="40" w:before="90"/>
       </w:pPr>
       <w:r>
         <w:rPr>
@@ -864,7 +951,7 @@
     </w:p>
     <w:sectPr>
       <w:pgSz w:w="11906" w:h="16838" w:orient="portrait"/>
-      <w:pgMar w:top="1000" w:right="1080" w:bottom="1000" w:left="1080" w:header="708" w:footer="708" w:gutter="0"/>
+      <w:pgMar w:top="600" w:right="900" w:bottom="480" w:left="900" w:header="708" w:footer="708" w:gutter="0"/>
       <w:pgNumType/>
       <w:docGrid w:linePitch="360"/>
     </w:sectPr>

</xml_diff>

<commit_message>
Retire la puce sur les analyses data publiees dans le CV telechargeable
</commit_message>
<xml_diff>
--- a/cv/CheikhSall_CV.docx
+++ b/cv/CheikhSall_CV.docx
@@ -368,23 +368,6 @@
           <w:szCs w:val="20"/>
         </w:rPr>
         <w:t xml:space="preserve">Assuré le déploiement et l'exploitation en production (Render, Supabase, Vercel), avec version PWA installable.</w:t>
-      </w:r>
-    </w:p>
-    <w:p>
-      <w:pPr>
-        <w:pStyle w:val="ListParagraph"/>
-        <w:numPr>
-          <w:ilvl w:val="0"/>
-          <w:numId w:val="2"/>
-        </w:numPr>
-        <w:spacing w:after="20" w:line="240"/>
-      </w:pPr>
-      <w:r>
-        <w:rPr>
-          <w:sz w:val="20"/>
-          <w:szCs w:val="20"/>
-        </w:rPr>
-        <w:t xml:space="preserve">Conduit et publié des analyses data de bout en bout sur données réelles (ANSD, Banque mondiale, WFP) : modélisation, prévision SARIMA/Prophet et tableaux de bord.</w:t>
       </w:r>
     </w:p>
     <w:p>

</xml_diff>